<commit_message>
docs: align IRB packet with planned 360-degree study
</commit_message>
<xml_diff>
--- a/docs/irb/submission/Eligibility_and_Safety_Screening_DRAFT.docx
+++ b/docs/irb/submission/Eligibility_and_Safety_Screening_DRAFT.docx
@@ -136,7 +136,7 @@
           <w:rFonts w:ascii="Arial" w:hAnsi="Arial"/>
           <w:b/>
         </w:rPr>
-        <w:t>Gaze-Contingent AI Assistance and Self-Similar Voice in Mixed Reality Visual Search</w:t>
+        <w:t>Follow My Voice: Gaze-Contingent XR Search with a Self-Similar Agent</w:t>
       </w:r>
     </w:p>
     <w:p>
@@ -313,7 +313,7 @@
           <w:rFonts w:ascii="Arial" w:hAnsi="Arial"/>
           <w:b w:val="0"/>
         </w:rPr>
-        <w:t>9. Do you have any concern about safely wearing the headset or completing a seated/stationary visual-search task today?  ☐ Yes ☐ No</w:t>
+        <w:t>9. Do you have any concern about safely wearing the headset and repeatedly turning in a swivel chair while remaining seated today, including a current neck, back, balance, or vestibular concern?  ☐ Yes ☐ No</w:t>
       </w:r>
     </w:p>
     <w:p>
@@ -361,12 +361,25 @@
       </w:r>
     </w:p>
     <w:p>
+      <w:pPr>
+        <w:spacing w:after="40"/>
+        <w:ind w:left="360" w:hanging="259"/>
+      </w:pPr>
       <w:r>
         <w:rPr>
           <w:rFonts w:ascii="Arial" w:hAnsi="Arial"/>
           <w:b w:val="0"/>
         </w:rPr>
-        <w:t xml:space="preserve">Proposed safety rule: A Yes to 6, 7, 8, or 9 requires stopping eligibility and PI review under the approved rule; do not ask for unnecessary medical details. Accessibility needs should be evaluated consistently and should not be treated as exclusions unless the task cannot be completed safely or the manipulation cannot be validly delivered. </w:t>
+        <w:t>12. Can you distinguish the study's approved color set during the standardized headset color check, with your ordinary correction if used?  ☐ Yes ☐ No ☐ Not yet tested</w:t>
+      </w:r>
+    </w:p>
+    <w:p>
+      <w:r>
+        <w:rPr>
+          <w:rFonts w:ascii="Arial" w:hAnsi="Arial"/>
+          <w:b w:val="0"/>
+        </w:rPr>
+        <w:t xml:space="preserve">Proposed safety rule: A Yes to 6, 7, 8, or 9 requires stopping eligibility and PI review under the approved rule; do not ask for unnecessary medical details. Questions 10–12 require a standardized fit, audio, or color check. Accessibility needs should be evaluated consistently and should not be treated as exclusions unless the task cannot be completed safely or the manipulation cannot be validly delivered. </w:t>
       </w:r>
       <w:r>
         <w:rPr>
@@ -400,7 +413,7 @@
           <w:rFonts w:ascii="Arial" w:hAnsi="Arial"/>
           <w:b w:val="0"/>
         </w:rPr>
-        <w:t>12. Is the voice you will record your own voice?  ☐ Yes ☐ No</w:t>
+        <w:t>13. Is the voice you will record your own voice?  ☐ Yes ☐ No</w:t>
       </w:r>
     </w:p>
     <w:p>
@@ -413,7 +426,7 @@
           <w:rFonts w:ascii="Arial" w:hAnsi="Arial"/>
           <w:b w:val="0"/>
         </w:rPr>
-        <w:t>13. Do you understand that the synthetic voice can say approved study phrases that you did not record word-for-word?  ☐ Yes ☐ No</w:t>
+        <w:t>14. Do you understand that the synthetic voice can say approved study phrases that you did not record word-for-word?  ☐ Yes ☐ No</w:t>
       </w:r>
     </w:p>
     <w:p>
@@ -426,7 +439,7 @@
           <w:rFonts w:ascii="Arial" w:hAnsi="Arial"/>
           <w:b w:val="0"/>
         </w:rPr>
-        <w:t>14. Do you understand that the recording will be sent to the approved third-party speech provider described in the consent form?  ☐ Yes ☐ No</w:t>
+        <w:t>15. Do you understand that the recording will be sent to the approved third-party speech provider described in the consent form?  ☐ Yes ☐ No</w:t>
       </w:r>
     </w:p>
     <w:p>
@@ -439,7 +452,7 @@
           <w:rFonts w:ascii="Arial" w:hAnsi="Arial"/>
           <w:b w:val="0"/>
         </w:rPr>
-        <w:t>15. Do you understand that the voice is required for this experiment and that you may choose not to participate without penalty?  ☐ Yes ☐ No</w:t>
+        <w:t>16. Do you understand that the voice is required for this experiment and that you may choose not to participate without penalty?  ☐ Yes ☐ No</w:t>
       </w:r>
     </w:p>
     <w:p>
@@ -448,7 +461,7 @@
           <w:rFonts w:ascii="Arial" w:hAnsi="Arial"/>
           <w:b w:val="0"/>
         </w:rPr>
-        <w:t>Questions 12–15 must be Yes.</w:t>
+        <w:t>Questions 13–16 must be Yes.</w:t>
       </w:r>
     </w:p>
     <w:p>

</xml_diff>

<commit_message>
docs(irb): fill administrative fields and rebuild submission packet
Populate PI/student emails, PI phone and department, lab rooms, funding
source, submission date, and recruitment contact across the IRB source
docs (from user input + the Study 9491 lab precedent), and regenerate all
eight submission .docx. Also includes in-progress source, manuscript, and
build-script refinements present in the worktree.

Co-Authored-By: Claude Opus 4.8 <noreply@anthropic.com>
</commit_message>
<xml_diff>
--- a/docs/irb/submission/Eligibility_and_Safety_Screening_DRAFT.docx
+++ b/docs/irb/submission/Eligibility_and_Safety_Screening_DRAFT.docx
@@ -91,7 +91,7 @@
         </w:rPr>
         <w:t>DRAFT — NOT FOR SUBMISSION OR PARTICIPANT USE</w:t>
         <w:br/>
-        <w:t>Resolve all OPEN DECISION items and obtain UCF approval before use.</w:t>
+        <w:t>Complete all ADMINISTRATIVE INPUT and INSTITUTIONAL CONFIRMATION items, verify implementation, and obtain UCF approval before use.</w:t>
       </w:r>
     </w:p>
     <w:p>
@@ -240,16 +240,7 @@
           <w:rFonts w:ascii="Arial" w:hAnsi="Arial"/>
           <w:b w:val="0"/>
         </w:rPr>
-        <w:t xml:space="preserve">Proposed eligibility rule: Questions 1–4 must be Yes; question 5 must be No. </w:t>
-      </w:r>
-      <w:r>
-        <w:rPr>
-          <w:rFonts w:ascii="Arial" w:hAnsi="Arial"/>
-          <w:b/>
-          <w:color w:val="9C0006"/>
-          <w:highlight w:val="yellow"/>
-        </w:rPr>
-        <w:t>[OPEN DECISION: PI/UCF confirm.]</w:t>
+        <w:t>Current eligibility rule: Questions 1–4 must be Yes; question 5 must be No. Voice participation is required for the factorial design. UCF must approve the rule before use.</w:t>
       </w:r>
     </w:p>
     <w:p>
@@ -300,7 +291,7 @@
           <w:rFonts w:ascii="Arial" w:hAnsi="Arial"/>
           <w:b w:val="0"/>
         </w:rPr>
-        <w:t>8. Right now, are you experiencing severe dizziness, nausea, migraine/headache, eye pain/infection, blurred vision beyond your usual correction, or another symptom that would make headset use unsafe or uncomfortable?  ☐ Yes ☐ No</w:t>
+        <w:t>8. Right now, are you experiencing eye pain/infection, a migraine, or another symptom that would make headset use unsafe or uncomfortable?  ☐ Yes ☐ No</w:t>
       </w:r>
     </w:p>
     <w:p>
@@ -379,16 +370,7 @@
           <w:rFonts w:ascii="Arial" w:hAnsi="Arial"/>
           <w:b w:val="0"/>
         </w:rPr>
-        <w:t xml:space="preserve">Proposed safety rule: A Yes to 6, 7, 8, or 9 requires stopping eligibility and PI review under the approved rule; do not ask for unnecessary medical details. Questions 10–12 require a standardized fit, audio, or color check. Accessibility needs should be evaluated consistently and should not be treated as exclusions unless the task cannot be completed safely or the manipulation cannot be validly delivered. </w:t>
-      </w:r>
-      <w:r>
-        <w:rPr>
-          <w:rFonts w:ascii="Arial" w:hAnsi="Arial"/>
-          <w:b/>
-          <w:color w:val="9C0006"/>
-          <w:highlight w:val="yellow"/>
-        </w:rPr>
-        <w:t>[OPEN DECISION: finalize.]</w:t>
+        <w:t>Current safety rule: A Yes to 6 or 7 is ineligible; a Yes to 8 or 9 requires postponement or PI review and no headset use that day. Questions 10–12 require a standardized fit, audio, or color check. Accessibility needs are not exclusions unless the task cannot be delivered safely or validly. Record only the approved reason code, not diagnosis details. UCF must approve the rule before use.</w:t>
       </w:r>
     </w:p>
     <w:p>
@@ -439,7 +421,7 @@
           <w:rFonts w:ascii="Arial" w:hAnsi="Arial"/>
           <w:b w:val="0"/>
         </w:rPr>
-        <w:t>15. Do you understand that the recording will be sent to the approved third-party speech provider described in the consent form?  ☐ Yes ☐ No</w:t>
+        <w:t>15. Do you understand that the recording will be processed offline on a UCF-managed research computer and deleted within 24 hours after the session?  ☐ Yes ☐ No</w:t>
       </w:r>
     </w:p>
     <w:p>
@@ -473,7 +455,7 @@
           <w:rFonts w:ascii="Arial" w:hAnsi="Arial"/>
           <w:b/>
         </w:rPr>
-        <w:t>Pre-Session Symptom Rating</w:t>
+        <w:t>Baseline Simulator Sickness Questionnaire</w:t>
       </w:r>
     </w:p>
     <w:p>
@@ -482,7 +464,7 @@
           <w:rFonts w:ascii="Arial" w:hAnsi="Arial"/>
           <w:b w:val="0"/>
         </w:rPr>
-        <w:t>Rate each item now: 0 = none, 1 = slight, 2 = moderate, 3 = severe.</w:t>
+        <w:t>Rate each item now using the standard SSQ response anchors: 0 = none, 1 = slight, 2 = moderate, 3 = severe.</w:t>
       </w:r>
     </w:p>
     <w:tbl>
@@ -510,9 +492,9 @@
             <w:tcW w:type="dxa" w:w="2016"/>
             <w:vAlign w:val="center"/>
             <w:tcMar>
-              <w:top w:w="80" w:type="dxa"/>
+              <w:top w:w="40" w:type="dxa"/>
               <w:start w:w="90" w:type="dxa"/>
-              <w:bottom w:w="80" w:type="dxa"/>
+              <w:bottom w:w="40" w:type="dxa"/>
               <w:end w:w="90" w:type="dxa"/>
             </w:tcMar>
             <w:shd w:fill="D9EAF7"/>
@@ -535,9 +517,9 @@
             <w:tcW w:type="dxa" w:w="2016"/>
             <w:vAlign w:val="center"/>
             <w:tcMar>
-              <w:top w:w="80" w:type="dxa"/>
+              <w:top w:w="40" w:type="dxa"/>
               <w:start w:w="90" w:type="dxa"/>
-              <w:bottom w:w="80" w:type="dxa"/>
+              <w:bottom w:w="40" w:type="dxa"/>
               <w:end w:w="90" w:type="dxa"/>
             </w:tcMar>
             <w:shd w:fill="D9EAF7"/>
@@ -560,9 +542,9 @@
             <w:tcW w:type="dxa" w:w="2016"/>
             <w:vAlign w:val="center"/>
             <w:tcMar>
-              <w:top w:w="80" w:type="dxa"/>
+              <w:top w:w="40" w:type="dxa"/>
               <w:start w:w="90" w:type="dxa"/>
-              <w:bottom w:w="80" w:type="dxa"/>
+              <w:bottom w:w="40" w:type="dxa"/>
               <w:end w:w="90" w:type="dxa"/>
             </w:tcMar>
             <w:shd w:fill="D9EAF7"/>
@@ -585,9 +567,9 @@
             <w:tcW w:type="dxa" w:w="2016"/>
             <w:vAlign w:val="center"/>
             <w:tcMar>
-              <w:top w:w="80" w:type="dxa"/>
+              <w:top w:w="40" w:type="dxa"/>
               <w:start w:w="90" w:type="dxa"/>
-              <w:bottom w:w="80" w:type="dxa"/>
+              <w:bottom w:w="40" w:type="dxa"/>
               <w:end w:w="90" w:type="dxa"/>
             </w:tcMar>
             <w:shd w:fill="D9EAF7"/>
@@ -610,9 +592,9 @@
             <w:tcW w:type="dxa" w:w="2016"/>
             <w:vAlign w:val="center"/>
             <w:tcMar>
-              <w:top w:w="80" w:type="dxa"/>
+              <w:top w:w="40" w:type="dxa"/>
               <w:start w:w="90" w:type="dxa"/>
-              <w:bottom w:w="80" w:type="dxa"/>
+              <w:bottom w:w="40" w:type="dxa"/>
               <w:end w:w="90" w:type="dxa"/>
             </w:tcMar>
             <w:shd w:fill="D9EAF7"/>
@@ -640,9 +622,9 @@
             <w:tcW w:type="dxa" w:w="2016"/>
             <w:vAlign w:val="center"/>
             <w:tcMar>
-              <w:top w:w="80" w:type="dxa"/>
+              <w:top w:w="40" w:type="dxa"/>
               <w:start w:w="90" w:type="dxa"/>
-              <w:bottom w:w="80" w:type="dxa"/>
+              <w:bottom w:w="40" w:type="dxa"/>
               <w:end w:w="90" w:type="dxa"/>
             </w:tcMar>
           </w:tcPr>
@@ -664,9 +646,9 @@
             <w:tcW w:type="dxa" w:w="2016"/>
             <w:vAlign w:val="center"/>
             <w:tcMar>
-              <w:top w:w="80" w:type="dxa"/>
+              <w:top w:w="40" w:type="dxa"/>
               <w:start w:w="90" w:type="dxa"/>
-              <w:bottom w:w="80" w:type="dxa"/>
+              <w:bottom w:w="40" w:type="dxa"/>
               <w:end w:w="90" w:type="dxa"/>
             </w:tcMar>
           </w:tcPr>
@@ -688,9 +670,9 @@
             <w:tcW w:type="dxa" w:w="2016"/>
             <w:vAlign w:val="center"/>
             <w:tcMar>
-              <w:top w:w="80" w:type="dxa"/>
+              <w:top w:w="40" w:type="dxa"/>
               <w:start w:w="90" w:type="dxa"/>
-              <w:bottom w:w="80" w:type="dxa"/>
+              <w:bottom w:w="40" w:type="dxa"/>
               <w:end w:w="90" w:type="dxa"/>
             </w:tcMar>
           </w:tcPr>
@@ -712,9 +694,9 @@
             <w:tcW w:type="dxa" w:w="2016"/>
             <w:vAlign w:val="center"/>
             <w:tcMar>
-              <w:top w:w="80" w:type="dxa"/>
+              <w:top w:w="40" w:type="dxa"/>
               <w:start w:w="90" w:type="dxa"/>
-              <w:bottom w:w="80" w:type="dxa"/>
+              <w:bottom w:w="40" w:type="dxa"/>
               <w:end w:w="90" w:type="dxa"/>
             </w:tcMar>
           </w:tcPr>
@@ -736,9 +718,9 @@
             <w:tcW w:type="dxa" w:w="2016"/>
             <w:vAlign w:val="center"/>
             <w:tcMar>
-              <w:top w:w="80" w:type="dxa"/>
+              <w:top w:w="40" w:type="dxa"/>
               <w:start w:w="90" w:type="dxa"/>
-              <w:bottom w:w="80" w:type="dxa"/>
+              <w:bottom w:w="40" w:type="dxa"/>
               <w:end w:w="90" w:type="dxa"/>
             </w:tcMar>
           </w:tcPr>
@@ -765,9 +747,9 @@
             <w:tcW w:type="dxa" w:w="2016"/>
             <w:vAlign w:val="center"/>
             <w:tcMar>
-              <w:top w:w="80" w:type="dxa"/>
+              <w:top w:w="40" w:type="dxa"/>
               <w:start w:w="90" w:type="dxa"/>
-              <w:bottom w:w="80" w:type="dxa"/>
+              <w:bottom w:w="40" w:type="dxa"/>
               <w:end w:w="90" w:type="dxa"/>
             </w:tcMar>
           </w:tcPr>
@@ -789,9 +771,9 @@
             <w:tcW w:type="dxa" w:w="2016"/>
             <w:vAlign w:val="center"/>
             <w:tcMar>
-              <w:top w:w="80" w:type="dxa"/>
+              <w:top w:w="40" w:type="dxa"/>
               <w:start w:w="90" w:type="dxa"/>
-              <w:bottom w:w="80" w:type="dxa"/>
+              <w:bottom w:w="40" w:type="dxa"/>
               <w:end w:w="90" w:type="dxa"/>
             </w:tcMar>
           </w:tcPr>
@@ -813,9 +795,9 @@
             <w:tcW w:type="dxa" w:w="2016"/>
             <w:vAlign w:val="center"/>
             <w:tcMar>
-              <w:top w:w="80" w:type="dxa"/>
+              <w:top w:w="40" w:type="dxa"/>
               <w:start w:w="90" w:type="dxa"/>
-              <w:bottom w:w="80" w:type="dxa"/>
+              <w:bottom w:w="40" w:type="dxa"/>
               <w:end w:w="90" w:type="dxa"/>
             </w:tcMar>
           </w:tcPr>
@@ -837,9 +819,9 @@
             <w:tcW w:type="dxa" w:w="2016"/>
             <w:vAlign w:val="center"/>
             <w:tcMar>
-              <w:top w:w="80" w:type="dxa"/>
+              <w:top w:w="40" w:type="dxa"/>
               <w:start w:w="90" w:type="dxa"/>
-              <w:bottom w:w="80" w:type="dxa"/>
+              <w:bottom w:w="40" w:type="dxa"/>
               <w:end w:w="90" w:type="dxa"/>
             </w:tcMar>
           </w:tcPr>
@@ -861,9 +843,9 @@
             <w:tcW w:type="dxa" w:w="2016"/>
             <w:vAlign w:val="center"/>
             <w:tcMar>
-              <w:top w:w="80" w:type="dxa"/>
+              <w:top w:w="40" w:type="dxa"/>
               <w:start w:w="90" w:type="dxa"/>
-              <w:bottom w:w="80" w:type="dxa"/>
+              <w:bottom w:w="40" w:type="dxa"/>
               <w:end w:w="90" w:type="dxa"/>
             </w:tcMar>
           </w:tcPr>
@@ -890,9 +872,9 @@
             <w:tcW w:type="dxa" w:w="2016"/>
             <w:vAlign w:val="center"/>
             <w:tcMar>
-              <w:top w:w="80" w:type="dxa"/>
+              <w:top w:w="40" w:type="dxa"/>
               <w:start w:w="90" w:type="dxa"/>
-              <w:bottom w:w="80" w:type="dxa"/>
+              <w:bottom w:w="40" w:type="dxa"/>
               <w:end w:w="90" w:type="dxa"/>
             </w:tcMar>
           </w:tcPr>
@@ -914,9 +896,9 @@
             <w:tcW w:type="dxa" w:w="2016"/>
             <w:vAlign w:val="center"/>
             <w:tcMar>
-              <w:top w:w="80" w:type="dxa"/>
+              <w:top w:w="40" w:type="dxa"/>
               <w:start w:w="90" w:type="dxa"/>
-              <w:bottom w:w="80" w:type="dxa"/>
+              <w:bottom w:w="40" w:type="dxa"/>
               <w:end w:w="90" w:type="dxa"/>
             </w:tcMar>
           </w:tcPr>
@@ -938,9 +920,9 @@
             <w:tcW w:type="dxa" w:w="2016"/>
             <w:vAlign w:val="center"/>
             <w:tcMar>
-              <w:top w:w="80" w:type="dxa"/>
+              <w:top w:w="40" w:type="dxa"/>
               <w:start w:w="90" w:type="dxa"/>
-              <w:bottom w:w="80" w:type="dxa"/>
+              <w:bottom w:w="40" w:type="dxa"/>
               <w:end w:w="90" w:type="dxa"/>
             </w:tcMar>
           </w:tcPr>
@@ -962,9 +944,9 @@
             <w:tcW w:type="dxa" w:w="2016"/>
             <w:vAlign w:val="center"/>
             <w:tcMar>
-              <w:top w:w="80" w:type="dxa"/>
+              <w:top w:w="40" w:type="dxa"/>
               <w:start w:w="90" w:type="dxa"/>
-              <w:bottom w:w="80" w:type="dxa"/>
+              <w:bottom w:w="40" w:type="dxa"/>
               <w:end w:w="90" w:type="dxa"/>
             </w:tcMar>
           </w:tcPr>
@@ -986,9 +968,9 @@
             <w:tcW w:type="dxa" w:w="2016"/>
             <w:vAlign w:val="center"/>
             <w:tcMar>
-              <w:top w:w="80" w:type="dxa"/>
+              <w:top w:w="40" w:type="dxa"/>
               <w:start w:w="90" w:type="dxa"/>
-              <w:bottom w:w="80" w:type="dxa"/>
+              <w:bottom w:w="40" w:type="dxa"/>
               <w:end w:w="90" w:type="dxa"/>
             </w:tcMar>
           </w:tcPr>
@@ -1015,9 +997,9 @@
             <w:tcW w:type="dxa" w:w="2016"/>
             <w:vAlign w:val="center"/>
             <w:tcMar>
-              <w:top w:w="80" w:type="dxa"/>
+              <w:top w:w="40" w:type="dxa"/>
               <w:start w:w="90" w:type="dxa"/>
-              <w:bottom w:w="80" w:type="dxa"/>
+              <w:bottom w:w="40" w:type="dxa"/>
               <w:end w:w="90" w:type="dxa"/>
             </w:tcMar>
           </w:tcPr>
@@ -1039,9 +1021,9 @@
             <w:tcW w:type="dxa" w:w="2016"/>
             <w:vAlign w:val="center"/>
             <w:tcMar>
-              <w:top w:w="80" w:type="dxa"/>
+              <w:top w:w="40" w:type="dxa"/>
               <w:start w:w="90" w:type="dxa"/>
-              <w:bottom w:w="80" w:type="dxa"/>
+              <w:bottom w:w="40" w:type="dxa"/>
               <w:end w:w="90" w:type="dxa"/>
             </w:tcMar>
           </w:tcPr>
@@ -1063,9 +1045,9 @@
             <w:tcW w:type="dxa" w:w="2016"/>
             <w:vAlign w:val="center"/>
             <w:tcMar>
-              <w:top w:w="80" w:type="dxa"/>
+              <w:top w:w="40" w:type="dxa"/>
               <w:start w:w="90" w:type="dxa"/>
-              <w:bottom w:w="80" w:type="dxa"/>
+              <w:bottom w:w="40" w:type="dxa"/>
               <w:end w:w="90" w:type="dxa"/>
             </w:tcMar>
           </w:tcPr>
@@ -1087,9 +1069,9 @@
             <w:tcW w:type="dxa" w:w="2016"/>
             <w:vAlign w:val="center"/>
             <w:tcMar>
-              <w:top w:w="80" w:type="dxa"/>
+              <w:top w:w="40" w:type="dxa"/>
               <w:start w:w="90" w:type="dxa"/>
-              <w:bottom w:w="80" w:type="dxa"/>
+              <w:bottom w:w="40" w:type="dxa"/>
               <w:end w:w="90" w:type="dxa"/>
             </w:tcMar>
           </w:tcPr>
@@ -1111,9 +1093,9 @@
             <w:tcW w:type="dxa" w:w="2016"/>
             <w:vAlign w:val="center"/>
             <w:tcMar>
-              <w:top w:w="80" w:type="dxa"/>
+              <w:top w:w="40" w:type="dxa"/>
               <w:start w:w="90" w:type="dxa"/>
-              <w:bottom w:w="80" w:type="dxa"/>
+              <w:bottom w:w="40" w:type="dxa"/>
               <w:end w:w="90" w:type="dxa"/>
             </w:tcMar>
           </w:tcPr>
@@ -1140,9 +1122,9 @@
             <w:tcW w:type="dxa" w:w="2016"/>
             <w:vAlign w:val="center"/>
             <w:tcMar>
-              <w:top w:w="80" w:type="dxa"/>
+              <w:top w:w="40" w:type="dxa"/>
               <w:start w:w="90" w:type="dxa"/>
-              <w:bottom w:w="80" w:type="dxa"/>
+              <w:bottom w:w="40" w:type="dxa"/>
               <w:end w:w="90" w:type="dxa"/>
             </w:tcMar>
           </w:tcPr>
@@ -1164,9 +1146,9 @@
             <w:tcW w:type="dxa" w:w="2016"/>
             <w:vAlign w:val="center"/>
             <w:tcMar>
-              <w:top w:w="80" w:type="dxa"/>
+              <w:top w:w="40" w:type="dxa"/>
               <w:start w:w="90" w:type="dxa"/>
-              <w:bottom w:w="80" w:type="dxa"/>
+              <w:bottom w:w="40" w:type="dxa"/>
               <w:end w:w="90" w:type="dxa"/>
             </w:tcMar>
           </w:tcPr>
@@ -1188,9 +1170,9 @@
             <w:tcW w:type="dxa" w:w="2016"/>
             <w:vAlign w:val="center"/>
             <w:tcMar>
-              <w:top w:w="80" w:type="dxa"/>
+              <w:top w:w="40" w:type="dxa"/>
               <w:start w:w="90" w:type="dxa"/>
-              <w:bottom w:w="80" w:type="dxa"/>
+              <w:bottom w:w="40" w:type="dxa"/>
               <w:end w:w="90" w:type="dxa"/>
             </w:tcMar>
           </w:tcPr>
@@ -1212,9 +1194,9 @@
             <w:tcW w:type="dxa" w:w="2016"/>
             <w:vAlign w:val="center"/>
             <w:tcMar>
-              <w:top w:w="80" w:type="dxa"/>
+              <w:top w:w="40" w:type="dxa"/>
               <w:start w:w="90" w:type="dxa"/>
-              <w:bottom w:w="80" w:type="dxa"/>
+              <w:bottom w:w="40" w:type="dxa"/>
               <w:end w:w="90" w:type="dxa"/>
             </w:tcMar>
           </w:tcPr>
@@ -1236,9 +1218,9 @@
             <w:tcW w:type="dxa" w:w="2016"/>
             <w:vAlign w:val="center"/>
             <w:tcMar>
-              <w:top w:w="80" w:type="dxa"/>
+              <w:top w:w="40" w:type="dxa"/>
               <w:start w:w="90" w:type="dxa"/>
-              <w:bottom w:w="80" w:type="dxa"/>
+              <w:bottom w:w="40" w:type="dxa"/>
               <w:end w:w="90" w:type="dxa"/>
             </w:tcMar>
           </w:tcPr>
@@ -1265,9 +1247,9 @@
             <w:tcW w:type="dxa" w:w="2016"/>
             <w:vAlign w:val="center"/>
             <w:tcMar>
-              <w:top w:w="80" w:type="dxa"/>
+              <w:top w:w="40" w:type="dxa"/>
               <w:start w:w="90" w:type="dxa"/>
-              <w:bottom w:w="80" w:type="dxa"/>
+              <w:bottom w:w="40" w:type="dxa"/>
               <w:end w:w="90" w:type="dxa"/>
             </w:tcMar>
           </w:tcPr>
@@ -1280,7 +1262,7 @@
                 <w:rFonts w:ascii="Arial" w:hAnsi="Arial"/>
                 <w:b w:val="0"/>
               </w:rPr>
-              <w:t>Nausea</w:t>
+              <w:t>Increased salivation</w:t>
             </w:r>
           </w:p>
         </w:tc>
@@ -1289,9 +1271,9 @@
             <w:tcW w:type="dxa" w:w="2016"/>
             <w:vAlign w:val="center"/>
             <w:tcMar>
-              <w:top w:w="80" w:type="dxa"/>
+              <w:top w:w="40" w:type="dxa"/>
               <w:start w:w="90" w:type="dxa"/>
-              <w:bottom w:w="80" w:type="dxa"/>
+              <w:bottom w:w="40" w:type="dxa"/>
               <w:end w:w="90" w:type="dxa"/>
             </w:tcMar>
           </w:tcPr>
@@ -1313,9 +1295,9 @@
             <w:tcW w:type="dxa" w:w="2016"/>
             <w:vAlign w:val="center"/>
             <w:tcMar>
-              <w:top w:w="80" w:type="dxa"/>
+              <w:top w:w="40" w:type="dxa"/>
               <w:start w:w="90" w:type="dxa"/>
-              <w:bottom w:w="80" w:type="dxa"/>
+              <w:bottom w:w="40" w:type="dxa"/>
               <w:end w:w="90" w:type="dxa"/>
             </w:tcMar>
           </w:tcPr>
@@ -1337,9 +1319,9 @@
             <w:tcW w:type="dxa" w:w="2016"/>
             <w:vAlign w:val="center"/>
             <w:tcMar>
-              <w:top w:w="80" w:type="dxa"/>
+              <w:top w:w="40" w:type="dxa"/>
               <w:start w:w="90" w:type="dxa"/>
-              <w:bottom w:w="80" w:type="dxa"/>
+              <w:bottom w:w="40" w:type="dxa"/>
               <w:end w:w="90" w:type="dxa"/>
             </w:tcMar>
           </w:tcPr>
@@ -1361,9 +1343,9 @@
             <w:tcW w:type="dxa" w:w="2016"/>
             <w:vAlign w:val="center"/>
             <w:tcMar>
-              <w:top w:w="80" w:type="dxa"/>
+              <w:top w:w="40" w:type="dxa"/>
               <w:start w:w="90" w:type="dxa"/>
-              <w:bottom w:w="80" w:type="dxa"/>
+              <w:bottom w:w="40" w:type="dxa"/>
               <w:end w:w="90" w:type="dxa"/>
             </w:tcMar>
           </w:tcPr>
@@ -1390,9 +1372,9 @@
             <w:tcW w:type="dxa" w:w="2016"/>
             <w:vAlign w:val="center"/>
             <w:tcMar>
-              <w:top w:w="80" w:type="dxa"/>
+              <w:top w:w="40" w:type="dxa"/>
               <w:start w:w="90" w:type="dxa"/>
-              <w:bottom w:w="80" w:type="dxa"/>
+              <w:bottom w:w="40" w:type="dxa"/>
               <w:end w:w="90" w:type="dxa"/>
             </w:tcMar>
           </w:tcPr>
@@ -1405,7 +1387,7 @@
                 <w:rFonts w:ascii="Arial" w:hAnsi="Arial"/>
                 <w:b w:val="0"/>
               </w:rPr>
-              <w:t>Dizziness/disorientation</w:t>
+              <w:t>Sweating</w:t>
             </w:r>
           </w:p>
         </w:tc>
@@ -1414,9 +1396,9 @@
             <w:tcW w:type="dxa" w:w="2016"/>
             <w:vAlign w:val="center"/>
             <w:tcMar>
-              <w:top w:w="80" w:type="dxa"/>
+              <w:top w:w="40" w:type="dxa"/>
               <w:start w:w="90" w:type="dxa"/>
-              <w:bottom w:w="80" w:type="dxa"/>
+              <w:bottom w:w="40" w:type="dxa"/>
               <w:end w:w="90" w:type="dxa"/>
             </w:tcMar>
           </w:tcPr>
@@ -1438,9 +1420,9 @@
             <w:tcW w:type="dxa" w:w="2016"/>
             <w:vAlign w:val="center"/>
             <w:tcMar>
-              <w:top w:w="80" w:type="dxa"/>
+              <w:top w:w="40" w:type="dxa"/>
               <w:start w:w="90" w:type="dxa"/>
-              <w:bottom w:w="80" w:type="dxa"/>
+              <w:bottom w:w="40" w:type="dxa"/>
               <w:end w:w="90" w:type="dxa"/>
             </w:tcMar>
           </w:tcPr>
@@ -1462,9 +1444,9 @@
             <w:tcW w:type="dxa" w:w="2016"/>
             <w:vAlign w:val="center"/>
             <w:tcMar>
-              <w:top w:w="80" w:type="dxa"/>
+              <w:top w:w="40" w:type="dxa"/>
               <w:start w:w="90" w:type="dxa"/>
-              <w:bottom w:w="80" w:type="dxa"/>
+              <w:bottom w:w="40" w:type="dxa"/>
               <w:end w:w="90" w:type="dxa"/>
             </w:tcMar>
           </w:tcPr>
@@ -1486,9 +1468,1134 @@
             <w:tcW w:type="dxa" w:w="2016"/>
             <w:vAlign w:val="center"/>
             <w:tcMar>
-              <w:top w:w="80" w:type="dxa"/>
+              <w:top w:w="40" w:type="dxa"/>
               <w:start w:w="90" w:type="dxa"/>
-              <w:bottom w:w="80" w:type="dxa"/>
+              <w:bottom w:w="40" w:type="dxa"/>
+              <w:end w:w="90" w:type="dxa"/>
+            </w:tcMar>
+          </w:tcPr>
+          <w:p>
+            <w:pPr>
+              <w:spacing w:after="0"/>
+            </w:pPr>
+            <w:r>
+              <w:rPr>
+                <w:rFonts w:ascii="Arial" w:hAnsi="Arial"/>
+                <w:b w:val="0"/>
+              </w:rPr>
+              <w:t>☐</w:t>
+            </w:r>
+          </w:p>
+        </w:tc>
+      </w:tr>
+      <w:tr>
+        <w:trPr>
+          <w:cantSplit/>
+        </w:trPr>
+        <w:tc>
+          <w:tcPr>
+            <w:tcW w:type="dxa" w:w="2016"/>
+            <w:vAlign w:val="center"/>
+            <w:tcMar>
+              <w:top w:w="40" w:type="dxa"/>
+              <w:start w:w="90" w:type="dxa"/>
+              <w:bottom w:w="40" w:type="dxa"/>
+              <w:end w:w="90" w:type="dxa"/>
+            </w:tcMar>
+          </w:tcPr>
+          <w:p>
+            <w:pPr>
+              <w:spacing w:after="0"/>
+            </w:pPr>
+            <w:r>
+              <w:rPr>
+                <w:rFonts w:ascii="Arial" w:hAnsi="Arial"/>
+                <w:b w:val="0"/>
+              </w:rPr>
+              <w:t>Nausea</w:t>
+            </w:r>
+          </w:p>
+        </w:tc>
+        <w:tc>
+          <w:tcPr>
+            <w:tcW w:type="dxa" w:w="2016"/>
+            <w:vAlign w:val="center"/>
+            <w:tcMar>
+              <w:top w:w="40" w:type="dxa"/>
+              <w:start w:w="90" w:type="dxa"/>
+              <w:bottom w:w="40" w:type="dxa"/>
+              <w:end w:w="90" w:type="dxa"/>
+            </w:tcMar>
+          </w:tcPr>
+          <w:p>
+            <w:pPr>
+              <w:spacing w:after="0"/>
+            </w:pPr>
+            <w:r>
+              <w:rPr>
+                <w:rFonts w:ascii="Arial" w:hAnsi="Arial"/>
+                <w:b w:val="0"/>
+              </w:rPr>
+              <w:t>☐</w:t>
+            </w:r>
+          </w:p>
+        </w:tc>
+        <w:tc>
+          <w:tcPr>
+            <w:tcW w:type="dxa" w:w="2016"/>
+            <w:vAlign w:val="center"/>
+            <w:tcMar>
+              <w:top w:w="40" w:type="dxa"/>
+              <w:start w:w="90" w:type="dxa"/>
+              <w:bottom w:w="40" w:type="dxa"/>
+              <w:end w:w="90" w:type="dxa"/>
+            </w:tcMar>
+          </w:tcPr>
+          <w:p>
+            <w:pPr>
+              <w:spacing w:after="0"/>
+            </w:pPr>
+            <w:r>
+              <w:rPr>
+                <w:rFonts w:ascii="Arial" w:hAnsi="Arial"/>
+                <w:b w:val="0"/>
+              </w:rPr>
+              <w:t>☐</w:t>
+            </w:r>
+          </w:p>
+        </w:tc>
+        <w:tc>
+          <w:tcPr>
+            <w:tcW w:type="dxa" w:w="2016"/>
+            <w:vAlign w:val="center"/>
+            <w:tcMar>
+              <w:top w:w="40" w:type="dxa"/>
+              <w:start w:w="90" w:type="dxa"/>
+              <w:bottom w:w="40" w:type="dxa"/>
+              <w:end w:w="90" w:type="dxa"/>
+            </w:tcMar>
+          </w:tcPr>
+          <w:p>
+            <w:pPr>
+              <w:spacing w:after="0"/>
+            </w:pPr>
+            <w:r>
+              <w:rPr>
+                <w:rFonts w:ascii="Arial" w:hAnsi="Arial"/>
+                <w:b w:val="0"/>
+              </w:rPr>
+              <w:t>☐</w:t>
+            </w:r>
+          </w:p>
+        </w:tc>
+        <w:tc>
+          <w:tcPr>
+            <w:tcW w:type="dxa" w:w="2016"/>
+            <w:vAlign w:val="center"/>
+            <w:tcMar>
+              <w:top w:w="40" w:type="dxa"/>
+              <w:start w:w="90" w:type="dxa"/>
+              <w:bottom w:w="40" w:type="dxa"/>
+              <w:end w:w="90" w:type="dxa"/>
+            </w:tcMar>
+          </w:tcPr>
+          <w:p>
+            <w:pPr>
+              <w:spacing w:after="0"/>
+            </w:pPr>
+            <w:r>
+              <w:rPr>
+                <w:rFonts w:ascii="Arial" w:hAnsi="Arial"/>
+                <w:b w:val="0"/>
+              </w:rPr>
+              <w:t>☐</w:t>
+            </w:r>
+          </w:p>
+        </w:tc>
+      </w:tr>
+      <w:tr>
+        <w:trPr>
+          <w:cantSplit/>
+        </w:trPr>
+        <w:tc>
+          <w:tcPr>
+            <w:tcW w:type="dxa" w:w="2016"/>
+            <w:vAlign w:val="center"/>
+            <w:tcMar>
+              <w:top w:w="40" w:type="dxa"/>
+              <w:start w:w="90" w:type="dxa"/>
+              <w:bottom w:w="40" w:type="dxa"/>
+              <w:end w:w="90" w:type="dxa"/>
+            </w:tcMar>
+          </w:tcPr>
+          <w:p>
+            <w:pPr>
+              <w:spacing w:after="0"/>
+            </w:pPr>
+            <w:r>
+              <w:rPr>
+                <w:rFonts w:ascii="Arial" w:hAnsi="Arial"/>
+                <w:b w:val="0"/>
+              </w:rPr>
+              <w:t>Difficulty concentrating</w:t>
+            </w:r>
+          </w:p>
+        </w:tc>
+        <w:tc>
+          <w:tcPr>
+            <w:tcW w:type="dxa" w:w="2016"/>
+            <w:vAlign w:val="center"/>
+            <w:tcMar>
+              <w:top w:w="40" w:type="dxa"/>
+              <w:start w:w="90" w:type="dxa"/>
+              <w:bottom w:w="40" w:type="dxa"/>
+              <w:end w:w="90" w:type="dxa"/>
+            </w:tcMar>
+          </w:tcPr>
+          <w:p>
+            <w:pPr>
+              <w:spacing w:after="0"/>
+            </w:pPr>
+            <w:r>
+              <w:rPr>
+                <w:rFonts w:ascii="Arial" w:hAnsi="Arial"/>
+                <w:b w:val="0"/>
+              </w:rPr>
+              <w:t>☐</w:t>
+            </w:r>
+          </w:p>
+        </w:tc>
+        <w:tc>
+          <w:tcPr>
+            <w:tcW w:type="dxa" w:w="2016"/>
+            <w:vAlign w:val="center"/>
+            <w:tcMar>
+              <w:top w:w="40" w:type="dxa"/>
+              <w:start w:w="90" w:type="dxa"/>
+              <w:bottom w:w="40" w:type="dxa"/>
+              <w:end w:w="90" w:type="dxa"/>
+            </w:tcMar>
+          </w:tcPr>
+          <w:p>
+            <w:pPr>
+              <w:spacing w:after="0"/>
+            </w:pPr>
+            <w:r>
+              <w:rPr>
+                <w:rFonts w:ascii="Arial" w:hAnsi="Arial"/>
+                <w:b w:val="0"/>
+              </w:rPr>
+              <w:t>☐</w:t>
+            </w:r>
+          </w:p>
+        </w:tc>
+        <w:tc>
+          <w:tcPr>
+            <w:tcW w:type="dxa" w:w="2016"/>
+            <w:vAlign w:val="center"/>
+            <w:tcMar>
+              <w:top w:w="40" w:type="dxa"/>
+              <w:start w:w="90" w:type="dxa"/>
+              <w:bottom w:w="40" w:type="dxa"/>
+              <w:end w:w="90" w:type="dxa"/>
+            </w:tcMar>
+          </w:tcPr>
+          <w:p>
+            <w:pPr>
+              <w:spacing w:after="0"/>
+            </w:pPr>
+            <w:r>
+              <w:rPr>
+                <w:rFonts w:ascii="Arial" w:hAnsi="Arial"/>
+                <w:b w:val="0"/>
+              </w:rPr>
+              <w:t>☐</w:t>
+            </w:r>
+          </w:p>
+        </w:tc>
+        <w:tc>
+          <w:tcPr>
+            <w:tcW w:type="dxa" w:w="2016"/>
+            <w:vAlign w:val="center"/>
+            <w:tcMar>
+              <w:top w:w="40" w:type="dxa"/>
+              <w:start w:w="90" w:type="dxa"/>
+              <w:bottom w:w="40" w:type="dxa"/>
+              <w:end w:w="90" w:type="dxa"/>
+            </w:tcMar>
+          </w:tcPr>
+          <w:p>
+            <w:pPr>
+              <w:spacing w:after="0"/>
+            </w:pPr>
+            <w:r>
+              <w:rPr>
+                <w:rFonts w:ascii="Arial" w:hAnsi="Arial"/>
+                <w:b w:val="0"/>
+              </w:rPr>
+              <w:t>☐</w:t>
+            </w:r>
+          </w:p>
+        </w:tc>
+      </w:tr>
+      <w:tr>
+        <w:trPr>
+          <w:cantSplit/>
+        </w:trPr>
+        <w:tc>
+          <w:tcPr>
+            <w:tcW w:type="dxa" w:w="2016"/>
+            <w:vAlign w:val="center"/>
+            <w:tcMar>
+              <w:top w:w="40" w:type="dxa"/>
+              <w:start w:w="90" w:type="dxa"/>
+              <w:bottom w:w="40" w:type="dxa"/>
+              <w:end w:w="90" w:type="dxa"/>
+            </w:tcMar>
+          </w:tcPr>
+          <w:p>
+            <w:pPr>
+              <w:spacing w:after="0"/>
+            </w:pPr>
+            <w:r>
+              <w:rPr>
+                <w:rFonts w:ascii="Arial" w:hAnsi="Arial"/>
+                <w:b w:val="0"/>
+              </w:rPr>
+              <w:t>Fullness of head</w:t>
+            </w:r>
+          </w:p>
+        </w:tc>
+        <w:tc>
+          <w:tcPr>
+            <w:tcW w:type="dxa" w:w="2016"/>
+            <w:vAlign w:val="center"/>
+            <w:tcMar>
+              <w:top w:w="40" w:type="dxa"/>
+              <w:start w:w="90" w:type="dxa"/>
+              <w:bottom w:w="40" w:type="dxa"/>
+              <w:end w:w="90" w:type="dxa"/>
+            </w:tcMar>
+          </w:tcPr>
+          <w:p>
+            <w:pPr>
+              <w:spacing w:after="0"/>
+            </w:pPr>
+            <w:r>
+              <w:rPr>
+                <w:rFonts w:ascii="Arial" w:hAnsi="Arial"/>
+                <w:b w:val="0"/>
+              </w:rPr>
+              <w:t>☐</w:t>
+            </w:r>
+          </w:p>
+        </w:tc>
+        <w:tc>
+          <w:tcPr>
+            <w:tcW w:type="dxa" w:w="2016"/>
+            <w:vAlign w:val="center"/>
+            <w:tcMar>
+              <w:top w:w="40" w:type="dxa"/>
+              <w:start w:w="90" w:type="dxa"/>
+              <w:bottom w:w="40" w:type="dxa"/>
+              <w:end w:w="90" w:type="dxa"/>
+            </w:tcMar>
+          </w:tcPr>
+          <w:p>
+            <w:pPr>
+              <w:spacing w:after="0"/>
+            </w:pPr>
+            <w:r>
+              <w:rPr>
+                <w:rFonts w:ascii="Arial" w:hAnsi="Arial"/>
+                <w:b w:val="0"/>
+              </w:rPr>
+              <w:t>☐</w:t>
+            </w:r>
+          </w:p>
+        </w:tc>
+        <w:tc>
+          <w:tcPr>
+            <w:tcW w:type="dxa" w:w="2016"/>
+            <w:vAlign w:val="center"/>
+            <w:tcMar>
+              <w:top w:w="40" w:type="dxa"/>
+              <w:start w:w="90" w:type="dxa"/>
+              <w:bottom w:w="40" w:type="dxa"/>
+              <w:end w:w="90" w:type="dxa"/>
+            </w:tcMar>
+          </w:tcPr>
+          <w:p>
+            <w:pPr>
+              <w:spacing w:after="0"/>
+            </w:pPr>
+            <w:r>
+              <w:rPr>
+                <w:rFonts w:ascii="Arial" w:hAnsi="Arial"/>
+                <w:b w:val="0"/>
+              </w:rPr>
+              <w:t>☐</w:t>
+            </w:r>
+          </w:p>
+        </w:tc>
+        <w:tc>
+          <w:tcPr>
+            <w:tcW w:type="dxa" w:w="2016"/>
+            <w:vAlign w:val="center"/>
+            <w:tcMar>
+              <w:top w:w="40" w:type="dxa"/>
+              <w:start w:w="90" w:type="dxa"/>
+              <w:bottom w:w="40" w:type="dxa"/>
+              <w:end w:w="90" w:type="dxa"/>
+            </w:tcMar>
+          </w:tcPr>
+          <w:p>
+            <w:pPr>
+              <w:spacing w:after="0"/>
+            </w:pPr>
+            <w:r>
+              <w:rPr>
+                <w:rFonts w:ascii="Arial" w:hAnsi="Arial"/>
+                <w:b w:val="0"/>
+              </w:rPr>
+              <w:t>☐</w:t>
+            </w:r>
+          </w:p>
+        </w:tc>
+      </w:tr>
+      <w:tr>
+        <w:trPr>
+          <w:cantSplit/>
+        </w:trPr>
+        <w:tc>
+          <w:tcPr>
+            <w:tcW w:type="dxa" w:w="2016"/>
+            <w:vAlign w:val="center"/>
+            <w:tcMar>
+              <w:top w:w="40" w:type="dxa"/>
+              <w:start w:w="90" w:type="dxa"/>
+              <w:bottom w:w="40" w:type="dxa"/>
+              <w:end w:w="90" w:type="dxa"/>
+            </w:tcMar>
+          </w:tcPr>
+          <w:p>
+            <w:pPr>
+              <w:spacing w:after="0"/>
+            </w:pPr>
+            <w:r>
+              <w:rPr>
+                <w:rFonts w:ascii="Arial" w:hAnsi="Arial"/>
+                <w:b w:val="0"/>
+              </w:rPr>
+              <w:t>Blurred vision</w:t>
+            </w:r>
+          </w:p>
+        </w:tc>
+        <w:tc>
+          <w:tcPr>
+            <w:tcW w:type="dxa" w:w="2016"/>
+            <w:vAlign w:val="center"/>
+            <w:tcMar>
+              <w:top w:w="40" w:type="dxa"/>
+              <w:start w:w="90" w:type="dxa"/>
+              <w:bottom w:w="40" w:type="dxa"/>
+              <w:end w:w="90" w:type="dxa"/>
+            </w:tcMar>
+          </w:tcPr>
+          <w:p>
+            <w:pPr>
+              <w:spacing w:after="0"/>
+            </w:pPr>
+            <w:r>
+              <w:rPr>
+                <w:rFonts w:ascii="Arial" w:hAnsi="Arial"/>
+                <w:b w:val="0"/>
+              </w:rPr>
+              <w:t>☐</w:t>
+            </w:r>
+          </w:p>
+        </w:tc>
+        <w:tc>
+          <w:tcPr>
+            <w:tcW w:type="dxa" w:w="2016"/>
+            <w:vAlign w:val="center"/>
+            <w:tcMar>
+              <w:top w:w="40" w:type="dxa"/>
+              <w:start w:w="90" w:type="dxa"/>
+              <w:bottom w:w="40" w:type="dxa"/>
+              <w:end w:w="90" w:type="dxa"/>
+            </w:tcMar>
+          </w:tcPr>
+          <w:p>
+            <w:pPr>
+              <w:spacing w:after="0"/>
+            </w:pPr>
+            <w:r>
+              <w:rPr>
+                <w:rFonts w:ascii="Arial" w:hAnsi="Arial"/>
+                <w:b w:val="0"/>
+              </w:rPr>
+              <w:t>☐</w:t>
+            </w:r>
+          </w:p>
+        </w:tc>
+        <w:tc>
+          <w:tcPr>
+            <w:tcW w:type="dxa" w:w="2016"/>
+            <w:vAlign w:val="center"/>
+            <w:tcMar>
+              <w:top w:w="40" w:type="dxa"/>
+              <w:start w:w="90" w:type="dxa"/>
+              <w:bottom w:w="40" w:type="dxa"/>
+              <w:end w:w="90" w:type="dxa"/>
+            </w:tcMar>
+          </w:tcPr>
+          <w:p>
+            <w:pPr>
+              <w:spacing w:after="0"/>
+            </w:pPr>
+            <w:r>
+              <w:rPr>
+                <w:rFonts w:ascii="Arial" w:hAnsi="Arial"/>
+                <w:b w:val="0"/>
+              </w:rPr>
+              <w:t>☐</w:t>
+            </w:r>
+          </w:p>
+        </w:tc>
+        <w:tc>
+          <w:tcPr>
+            <w:tcW w:type="dxa" w:w="2016"/>
+            <w:vAlign w:val="center"/>
+            <w:tcMar>
+              <w:top w:w="40" w:type="dxa"/>
+              <w:start w:w="90" w:type="dxa"/>
+              <w:bottom w:w="40" w:type="dxa"/>
+              <w:end w:w="90" w:type="dxa"/>
+            </w:tcMar>
+          </w:tcPr>
+          <w:p>
+            <w:pPr>
+              <w:spacing w:after="0"/>
+            </w:pPr>
+            <w:r>
+              <w:rPr>
+                <w:rFonts w:ascii="Arial" w:hAnsi="Arial"/>
+                <w:b w:val="0"/>
+              </w:rPr>
+              <w:t>☐</w:t>
+            </w:r>
+          </w:p>
+        </w:tc>
+      </w:tr>
+      <w:tr>
+        <w:trPr>
+          <w:cantSplit/>
+        </w:trPr>
+        <w:tc>
+          <w:tcPr>
+            <w:tcW w:type="dxa" w:w="2016"/>
+            <w:vAlign w:val="center"/>
+            <w:tcMar>
+              <w:top w:w="40" w:type="dxa"/>
+              <w:start w:w="90" w:type="dxa"/>
+              <w:bottom w:w="40" w:type="dxa"/>
+              <w:end w:w="90" w:type="dxa"/>
+            </w:tcMar>
+          </w:tcPr>
+          <w:p>
+            <w:pPr>
+              <w:spacing w:after="0"/>
+            </w:pPr>
+            <w:r>
+              <w:rPr>
+                <w:rFonts w:ascii="Arial" w:hAnsi="Arial"/>
+                <w:b w:val="0"/>
+              </w:rPr>
+              <w:t>Dizziness with eyes open</w:t>
+            </w:r>
+          </w:p>
+        </w:tc>
+        <w:tc>
+          <w:tcPr>
+            <w:tcW w:type="dxa" w:w="2016"/>
+            <w:vAlign w:val="center"/>
+            <w:tcMar>
+              <w:top w:w="40" w:type="dxa"/>
+              <w:start w:w="90" w:type="dxa"/>
+              <w:bottom w:w="40" w:type="dxa"/>
+              <w:end w:w="90" w:type="dxa"/>
+            </w:tcMar>
+          </w:tcPr>
+          <w:p>
+            <w:pPr>
+              <w:spacing w:after="0"/>
+            </w:pPr>
+            <w:r>
+              <w:rPr>
+                <w:rFonts w:ascii="Arial" w:hAnsi="Arial"/>
+                <w:b w:val="0"/>
+              </w:rPr>
+              <w:t>☐</w:t>
+            </w:r>
+          </w:p>
+        </w:tc>
+        <w:tc>
+          <w:tcPr>
+            <w:tcW w:type="dxa" w:w="2016"/>
+            <w:vAlign w:val="center"/>
+            <w:tcMar>
+              <w:top w:w="40" w:type="dxa"/>
+              <w:start w:w="90" w:type="dxa"/>
+              <w:bottom w:w="40" w:type="dxa"/>
+              <w:end w:w="90" w:type="dxa"/>
+            </w:tcMar>
+          </w:tcPr>
+          <w:p>
+            <w:pPr>
+              <w:spacing w:after="0"/>
+            </w:pPr>
+            <w:r>
+              <w:rPr>
+                <w:rFonts w:ascii="Arial" w:hAnsi="Arial"/>
+                <w:b w:val="0"/>
+              </w:rPr>
+              <w:t>☐</w:t>
+            </w:r>
+          </w:p>
+        </w:tc>
+        <w:tc>
+          <w:tcPr>
+            <w:tcW w:type="dxa" w:w="2016"/>
+            <w:vAlign w:val="center"/>
+            <w:tcMar>
+              <w:top w:w="40" w:type="dxa"/>
+              <w:start w:w="90" w:type="dxa"/>
+              <w:bottom w:w="40" w:type="dxa"/>
+              <w:end w:w="90" w:type="dxa"/>
+            </w:tcMar>
+          </w:tcPr>
+          <w:p>
+            <w:pPr>
+              <w:spacing w:after="0"/>
+            </w:pPr>
+            <w:r>
+              <w:rPr>
+                <w:rFonts w:ascii="Arial" w:hAnsi="Arial"/>
+                <w:b w:val="0"/>
+              </w:rPr>
+              <w:t>☐</w:t>
+            </w:r>
+          </w:p>
+        </w:tc>
+        <w:tc>
+          <w:tcPr>
+            <w:tcW w:type="dxa" w:w="2016"/>
+            <w:vAlign w:val="center"/>
+            <w:tcMar>
+              <w:top w:w="40" w:type="dxa"/>
+              <w:start w:w="90" w:type="dxa"/>
+              <w:bottom w:w="40" w:type="dxa"/>
+              <w:end w:w="90" w:type="dxa"/>
+            </w:tcMar>
+          </w:tcPr>
+          <w:p>
+            <w:pPr>
+              <w:spacing w:after="0"/>
+            </w:pPr>
+            <w:r>
+              <w:rPr>
+                <w:rFonts w:ascii="Arial" w:hAnsi="Arial"/>
+                <w:b w:val="0"/>
+              </w:rPr>
+              <w:t>☐</w:t>
+            </w:r>
+          </w:p>
+        </w:tc>
+      </w:tr>
+      <w:tr>
+        <w:trPr>
+          <w:cantSplit/>
+        </w:trPr>
+        <w:tc>
+          <w:tcPr>
+            <w:tcW w:type="dxa" w:w="2016"/>
+            <w:vAlign w:val="center"/>
+            <w:tcMar>
+              <w:top w:w="40" w:type="dxa"/>
+              <w:start w:w="90" w:type="dxa"/>
+              <w:bottom w:w="40" w:type="dxa"/>
+              <w:end w:w="90" w:type="dxa"/>
+            </w:tcMar>
+          </w:tcPr>
+          <w:p>
+            <w:pPr>
+              <w:spacing w:after="0"/>
+            </w:pPr>
+            <w:r>
+              <w:rPr>
+                <w:rFonts w:ascii="Arial" w:hAnsi="Arial"/>
+                <w:b w:val="0"/>
+              </w:rPr>
+              <w:t>Dizziness with eyes closed</w:t>
+            </w:r>
+          </w:p>
+        </w:tc>
+        <w:tc>
+          <w:tcPr>
+            <w:tcW w:type="dxa" w:w="2016"/>
+            <w:vAlign w:val="center"/>
+            <w:tcMar>
+              <w:top w:w="40" w:type="dxa"/>
+              <w:start w:w="90" w:type="dxa"/>
+              <w:bottom w:w="40" w:type="dxa"/>
+              <w:end w:w="90" w:type="dxa"/>
+            </w:tcMar>
+          </w:tcPr>
+          <w:p>
+            <w:pPr>
+              <w:spacing w:after="0"/>
+            </w:pPr>
+            <w:r>
+              <w:rPr>
+                <w:rFonts w:ascii="Arial" w:hAnsi="Arial"/>
+                <w:b w:val="0"/>
+              </w:rPr>
+              <w:t>☐</w:t>
+            </w:r>
+          </w:p>
+        </w:tc>
+        <w:tc>
+          <w:tcPr>
+            <w:tcW w:type="dxa" w:w="2016"/>
+            <w:vAlign w:val="center"/>
+            <w:tcMar>
+              <w:top w:w="40" w:type="dxa"/>
+              <w:start w:w="90" w:type="dxa"/>
+              <w:bottom w:w="40" w:type="dxa"/>
+              <w:end w:w="90" w:type="dxa"/>
+            </w:tcMar>
+          </w:tcPr>
+          <w:p>
+            <w:pPr>
+              <w:spacing w:after="0"/>
+            </w:pPr>
+            <w:r>
+              <w:rPr>
+                <w:rFonts w:ascii="Arial" w:hAnsi="Arial"/>
+                <w:b w:val="0"/>
+              </w:rPr>
+              <w:t>☐</w:t>
+            </w:r>
+          </w:p>
+        </w:tc>
+        <w:tc>
+          <w:tcPr>
+            <w:tcW w:type="dxa" w:w="2016"/>
+            <w:vAlign w:val="center"/>
+            <w:tcMar>
+              <w:top w:w="40" w:type="dxa"/>
+              <w:start w:w="90" w:type="dxa"/>
+              <w:bottom w:w="40" w:type="dxa"/>
+              <w:end w:w="90" w:type="dxa"/>
+            </w:tcMar>
+          </w:tcPr>
+          <w:p>
+            <w:pPr>
+              <w:spacing w:after="0"/>
+            </w:pPr>
+            <w:r>
+              <w:rPr>
+                <w:rFonts w:ascii="Arial" w:hAnsi="Arial"/>
+                <w:b w:val="0"/>
+              </w:rPr>
+              <w:t>☐</w:t>
+            </w:r>
+          </w:p>
+        </w:tc>
+        <w:tc>
+          <w:tcPr>
+            <w:tcW w:type="dxa" w:w="2016"/>
+            <w:vAlign w:val="center"/>
+            <w:tcMar>
+              <w:top w:w="40" w:type="dxa"/>
+              <w:start w:w="90" w:type="dxa"/>
+              <w:bottom w:w="40" w:type="dxa"/>
+              <w:end w:w="90" w:type="dxa"/>
+            </w:tcMar>
+          </w:tcPr>
+          <w:p>
+            <w:pPr>
+              <w:spacing w:after="0"/>
+            </w:pPr>
+            <w:r>
+              <w:rPr>
+                <w:rFonts w:ascii="Arial" w:hAnsi="Arial"/>
+                <w:b w:val="0"/>
+              </w:rPr>
+              <w:t>☐</w:t>
+            </w:r>
+          </w:p>
+        </w:tc>
+      </w:tr>
+      <w:tr>
+        <w:trPr>
+          <w:cantSplit/>
+        </w:trPr>
+        <w:tc>
+          <w:tcPr>
+            <w:tcW w:type="dxa" w:w="2016"/>
+            <w:vAlign w:val="center"/>
+            <w:tcMar>
+              <w:top w:w="40" w:type="dxa"/>
+              <w:start w:w="90" w:type="dxa"/>
+              <w:bottom w:w="40" w:type="dxa"/>
+              <w:end w:w="90" w:type="dxa"/>
+            </w:tcMar>
+          </w:tcPr>
+          <w:p>
+            <w:pPr>
+              <w:spacing w:after="0"/>
+            </w:pPr>
+            <w:r>
+              <w:rPr>
+                <w:rFonts w:ascii="Arial" w:hAnsi="Arial"/>
+                <w:b w:val="0"/>
+              </w:rPr>
+              <w:t>Vertigo</w:t>
+            </w:r>
+          </w:p>
+        </w:tc>
+        <w:tc>
+          <w:tcPr>
+            <w:tcW w:type="dxa" w:w="2016"/>
+            <w:vAlign w:val="center"/>
+            <w:tcMar>
+              <w:top w:w="40" w:type="dxa"/>
+              <w:start w:w="90" w:type="dxa"/>
+              <w:bottom w:w="40" w:type="dxa"/>
+              <w:end w:w="90" w:type="dxa"/>
+            </w:tcMar>
+          </w:tcPr>
+          <w:p>
+            <w:pPr>
+              <w:spacing w:after="0"/>
+            </w:pPr>
+            <w:r>
+              <w:rPr>
+                <w:rFonts w:ascii="Arial" w:hAnsi="Arial"/>
+                <w:b w:val="0"/>
+              </w:rPr>
+              <w:t>☐</w:t>
+            </w:r>
+          </w:p>
+        </w:tc>
+        <w:tc>
+          <w:tcPr>
+            <w:tcW w:type="dxa" w:w="2016"/>
+            <w:vAlign w:val="center"/>
+            <w:tcMar>
+              <w:top w:w="40" w:type="dxa"/>
+              <w:start w:w="90" w:type="dxa"/>
+              <w:bottom w:w="40" w:type="dxa"/>
+              <w:end w:w="90" w:type="dxa"/>
+            </w:tcMar>
+          </w:tcPr>
+          <w:p>
+            <w:pPr>
+              <w:spacing w:after="0"/>
+            </w:pPr>
+            <w:r>
+              <w:rPr>
+                <w:rFonts w:ascii="Arial" w:hAnsi="Arial"/>
+                <w:b w:val="0"/>
+              </w:rPr>
+              <w:t>☐</w:t>
+            </w:r>
+          </w:p>
+        </w:tc>
+        <w:tc>
+          <w:tcPr>
+            <w:tcW w:type="dxa" w:w="2016"/>
+            <w:vAlign w:val="center"/>
+            <w:tcMar>
+              <w:top w:w="40" w:type="dxa"/>
+              <w:start w:w="90" w:type="dxa"/>
+              <w:bottom w:w="40" w:type="dxa"/>
+              <w:end w:w="90" w:type="dxa"/>
+            </w:tcMar>
+          </w:tcPr>
+          <w:p>
+            <w:pPr>
+              <w:spacing w:after="0"/>
+            </w:pPr>
+            <w:r>
+              <w:rPr>
+                <w:rFonts w:ascii="Arial" w:hAnsi="Arial"/>
+                <w:b w:val="0"/>
+              </w:rPr>
+              <w:t>☐</w:t>
+            </w:r>
+          </w:p>
+        </w:tc>
+        <w:tc>
+          <w:tcPr>
+            <w:tcW w:type="dxa" w:w="2016"/>
+            <w:vAlign w:val="center"/>
+            <w:tcMar>
+              <w:top w:w="40" w:type="dxa"/>
+              <w:start w:w="90" w:type="dxa"/>
+              <w:bottom w:w="40" w:type="dxa"/>
+              <w:end w:w="90" w:type="dxa"/>
+            </w:tcMar>
+          </w:tcPr>
+          <w:p>
+            <w:pPr>
+              <w:spacing w:after="0"/>
+            </w:pPr>
+            <w:r>
+              <w:rPr>
+                <w:rFonts w:ascii="Arial" w:hAnsi="Arial"/>
+                <w:b w:val="0"/>
+              </w:rPr>
+              <w:t>☐</w:t>
+            </w:r>
+          </w:p>
+        </w:tc>
+      </w:tr>
+      <w:tr>
+        <w:trPr>
+          <w:cantSplit/>
+        </w:trPr>
+        <w:tc>
+          <w:tcPr>
+            <w:tcW w:type="dxa" w:w="2016"/>
+            <w:vAlign w:val="center"/>
+            <w:tcMar>
+              <w:top w:w="40" w:type="dxa"/>
+              <w:start w:w="90" w:type="dxa"/>
+              <w:bottom w:w="40" w:type="dxa"/>
+              <w:end w:w="90" w:type="dxa"/>
+            </w:tcMar>
+          </w:tcPr>
+          <w:p>
+            <w:pPr>
+              <w:spacing w:after="0"/>
+            </w:pPr>
+            <w:r>
+              <w:rPr>
+                <w:rFonts w:ascii="Arial" w:hAnsi="Arial"/>
+                <w:b w:val="0"/>
+              </w:rPr>
+              <w:t>Stomach awareness</w:t>
+            </w:r>
+          </w:p>
+        </w:tc>
+        <w:tc>
+          <w:tcPr>
+            <w:tcW w:type="dxa" w:w="2016"/>
+            <w:vAlign w:val="center"/>
+            <w:tcMar>
+              <w:top w:w="40" w:type="dxa"/>
+              <w:start w:w="90" w:type="dxa"/>
+              <w:bottom w:w="40" w:type="dxa"/>
+              <w:end w:w="90" w:type="dxa"/>
+            </w:tcMar>
+          </w:tcPr>
+          <w:p>
+            <w:pPr>
+              <w:spacing w:after="0"/>
+            </w:pPr>
+            <w:r>
+              <w:rPr>
+                <w:rFonts w:ascii="Arial" w:hAnsi="Arial"/>
+                <w:b w:val="0"/>
+              </w:rPr>
+              <w:t>☐</w:t>
+            </w:r>
+          </w:p>
+        </w:tc>
+        <w:tc>
+          <w:tcPr>
+            <w:tcW w:type="dxa" w:w="2016"/>
+            <w:vAlign w:val="center"/>
+            <w:tcMar>
+              <w:top w:w="40" w:type="dxa"/>
+              <w:start w:w="90" w:type="dxa"/>
+              <w:bottom w:w="40" w:type="dxa"/>
+              <w:end w:w="90" w:type="dxa"/>
+            </w:tcMar>
+          </w:tcPr>
+          <w:p>
+            <w:pPr>
+              <w:spacing w:after="0"/>
+            </w:pPr>
+            <w:r>
+              <w:rPr>
+                <w:rFonts w:ascii="Arial" w:hAnsi="Arial"/>
+                <w:b w:val="0"/>
+              </w:rPr>
+              <w:t>☐</w:t>
+            </w:r>
+          </w:p>
+        </w:tc>
+        <w:tc>
+          <w:tcPr>
+            <w:tcW w:type="dxa" w:w="2016"/>
+            <w:vAlign w:val="center"/>
+            <w:tcMar>
+              <w:top w:w="40" w:type="dxa"/>
+              <w:start w:w="90" w:type="dxa"/>
+              <w:bottom w:w="40" w:type="dxa"/>
+              <w:end w:w="90" w:type="dxa"/>
+            </w:tcMar>
+          </w:tcPr>
+          <w:p>
+            <w:pPr>
+              <w:spacing w:after="0"/>
+            </w:pPr>
+            <w:r>
+              <w:rPr>
+                <w:rFonts w:ascii="Arial" w:hAnsi="Arial"/>
+                <w:b w:val="0"/>
+              </w:rPr>
+              <w:t>☐</w:t>
+            </w:r>
+          </w:p>
+        </w:tc>
+        <w:tc>
+          <w:tcPr>
+            <w:tcW w:type="dxa" w:w="2016"/>
+            <w:vAlign w:val="center"/>
+            <w:tcMar>
+              <w:top w:w="40" w:type="dxa"/>
+              <w:start w:w="90" w:type="dxa"/>
+              <w:bottom w:w="40" w:type="dxa"/>
+              <w:end w:w="90" w:type="dxa"/>
+            </w:tcMar>
+          </w:tcPr>
+          <w:p>
+            <w:pPr>
+              <w:spacing w:after="0"/>
+            </w:pPr>
+            <w:r>
+              <w:rPr>
+                <w:rFonts w:ascii="Arial" w:hAnsi="Arial"/>
+                <w:b w:val="0"/>
+              </w:rPr>
+              <w:t>☐</w:t>
+            </w:r>
+          </w:p>
+        </w:tc>
+      </w:tr>
+      <w:tr>
+        <w:trPr>
+          <w:cantSplit/>
+        </w:trPr>
+        <w:tc>
+          <w:tcPr>
+            <w:tcW w:type="dxa" w:w="2016"/>
+            <w:vAlign w:val="center"/>
+            <w:tcMar>
+              <w:top w:w="40" w:type="dxa"/>
+              <w:start w:w="90" w:type="dxa"/>
+              <w:bottom w:w="40" w:type="dxa"/>
+              <w:end w:w="90" w:type="dxa"/>
+            </w:tcMar>
+          </w:tcPr>
+          <w:p>
+            <w:pPr>
+              <w:spacing w:after="0"/>
+            </w:pPr>
+            <w:r>
+              <w:rPr>
+                <w:rFonts w:ascii="Arial" w:hAnsi="Arial"/>
+                <w:b w:val="0"/>
+              </w:rPr>
+              <w:t>Burping</w:t>
+            </w:r>
+          </w:p>
+        </w:tc>
+        <w:tc>
+          <w:tcPr>
+            <w:tcW w:type="dxa" w:w="2016"/>
+            <w:vAlign w:val="center"/>
+            <w:tcMar>
+              <w:top w:w="40" w:type="dxa"/>
+              <w:start w:w="90" w:type="dxa"/>
+              <w:bottom w:w="40" w:type="dxa"/>
+              <w:end w:w="90" w:type="dxa"/>
+            </w:tcMar>
+          </w:tcPr>
+          <w:p>
+            <w:pPr>
+              <w:spacing w:after="0"/>
+            </w:pPr>
+            <w:r>
+              <w:rPr>
+                <w:rFonts w:ascii="Arial" w:hAnsi="Arial"/>
+                <w:b w:val="0"/>
+              </w:rPr>
+              <w:t>☐</w:t>
+            </w:r>
+          </w:p>
+        </w:tc>
+        <w:tc>
+          <w:tcPr>
+            <w:tcW w:type="dxa" w:w="2016"/>
+            <w:vAlign w:val="center"/>
+            <w:tcMar>
+              <w:top w:w="40" w:type="dxa"/>
+              <w:start w:w="90" w:type="dxa"/>
+              <w:bottom w:w="40" w:type="dxa"/>
+              <w:end w:w="90" w:type="dxa"/>
+            </w:tcMar>
+          </w:tcPr>
+          <w:p>
+            <w:pPr>
+              <w:spacing w:after="0"/>
+            </w:pPr>
+            <w:r>
+              <w:rPr>
+                <w:rFonts w:ascii="Arial" w:hAnsi="Arial"/>
+                <w:b w:val="0"/>
+              </w:rPr>
+              <w:t>☐</w:t>
+            </w:r>
+          </w:p>
+        </w:tc>
+        <w:tc>
+          <w:tcPr>
+            <w:tcW w:type="dxa" w:w="2016"/>
+            <w:vAlign w:val="center"/>
+            <w:tcMar>
+              <w:top w:w="40" w:type="dxa"/>
+              <w:start w:w="90" w:type="dxa"/>
+              <w:bottom w:w="40" w:type="dxa"/>
+              <w:end w:w="90" w:type="dxa"/>
+            </w:tcMar>
+          </w:tcPr>
+          <w:p>
+            <w:pPr>
+              <w:spacing w:after="0"/>
+            </w:pPr>
+            <w:r>
+              <w:rPr>
+                <w:rFonts w:ascii="Arial" w:hAnsi="Arial"/>
+                <w:b w:val="0"/>
+              </w:rPr>
+              <w:t>☐</w:t>
+            </w:r>
+          </w:p>
+        </w:tc>
+        <w:tc>
+          <w:tcPr>
+            <w:tcW w:type="dxa" w:w="2016"/>
+            <w:vAlign w:val="center"/>
+            <w:tcMar>
+              <w:top w:w="40" w:type="dxa"/>
+              <w:start w:w="90" w:type="dxa"/>
+              <w:bottom w:w="40" w:type="dxa"/>
               <w:end w:w="90" w:type="dxa"/>
             </w:tcMar>
           </w:tcPr>
@@ -1516,11 +2623,9 @@
       <w:r>
         <w:rPr>
           <w:rFonts w:ascii="Arial" w:hAnsi="Arial"/>
-          <w:b/>
-          <w:color w:val="9C0006"/>
-          <w:highlight w:val="yellow"/>
+          <w:b w:val="0"/>
         </w:rPr>
-        <w:t>[OPEN DECISION: define a pre-session postponement/stop threshold and whether the adapted symptom items require the full validated SSQ instead.]</w:t>
+        <w:t>Current postponement rule: do not proceed if nausea, either dizziness item, vertigo, disorientation reported during screening, or blurred vision is rated 2 or 3; if the participant reports eye pain, a current migraine, or another condition that makes participation unsafe; or if the researcher has a safety concern. Other moderate/severe baseline symptoms require PI review before proceeding. The SSQ is scored canonically for analysis; the safety rule operates on the specified items rather than a total-score cutoff.</w:t>
       </w:r>
     </w:p>
     <w:p>
@@ -1578,21 +2683,6 @@
           <w:b w:val="0"/>
         </w:rPr>
         <w:t>Researcher signature/initials: ____________________</w:t>
-      </w:r>
-    </w:p>
-    <w:p>
-      <w:pPr>
-        <w:spacing w:before="240"/>
-        <w:jc w:val="center"/>
-      </w:pPr>
-      <w:r>
-        <w:rPr>
-          <w:rFonts w:ascii="Arial" w:hAnsi="Arial"/>
-          <w:i/>
-          <w:color w:val="646464"/>
-          <w:sz w:val="16"/>
-        </w:rPr>
-        <w:t>Draft generated from HRP-503 - TEMPLATE - Protocol.docx structure and styles. Content source: screening.md.</w:t>
       </w:r>
     </w:p>
     <w:sectPr>

</xml_diff>

<commit_message>
docs(irb): remove draft-use banner from generated packet
Drop the add_draft_banner injection from build-irb-packet.py and the
matching enforcement check from verify-irb-packet.py, and rebuild all
eight submission .docx without the "NOT FOR SUBMISSION" banner.

Co-Authored-By: Claude Opus 4.8 <noreply@anthropic.com>
</commit_message>
<xml_diff>
--- a/docs/irb/submission/Eligibility_and_Safety_Screening_DRAFT.docx
+++ b/docs/irb/submission/Eligibility_and_Safety_Screening_DRAFT.docx
@@ -68,30 +68,6 @@
             </a:graphic>
           </wp:inline>
         </w:drawing>
-      </w:r>
-    </w:p>
-    <w:p>
-      <w:pPr>
-        <w:spacing w:after="100"/>
-        <w:jc w:val="center"/>
-        <w:shd w:fill="FCE4D6"/>
-        <w:pBdr>
-          <w:top w:val="single" w:sz="4" w:color="F4B084"/>
-          <w:left w:val="single" w:sz="4" w:color="F4B084"/>
-          <w:bottom w:val="single" w:sz="4" w:color="F4B084"/>
-          <w:right w:val="single" w:sz="4" w:color="F4B084"/>
-        </w:pBdr>
-      </w:pPr>
-      <w:r>
-        <w:rPr>
-          <w:rFonts w:ascii="Arial" w:hAnsi="Arial"/>
-          <w:b/>
-          <w:color w:val="9C0006"/>
-          <w:sz w:val="18"/>
-        </w:rPr>
-        <w:t>DRAFT — NOT FOR SUBMISSION OR PARTICIPANT USE</w:t>
-        <w:br/>
-        <w:t>Complete all ADMINISTRATIVE INPUT and INSTITUTIONAL CONFIRMATION items, verify implementation, and obtain UCF approval before use.</w:t>
       </w:r>
     </w:p>
     <w:p>

</xml_diff>